<commit_message>
updated the some details
</commit_message>
<xml_diff>
--- a/Rohan-Adhia-Resume.docx
+++ b/Rohan-Adhia-Resume.docx
@@ -159,7 +159,7 @@
         <w:rPr>
           <w:rFonts w:eastAsia="Times New Roman" w:cs="Times New Roman"/>
         </w:rPr>
-        <w:t>Andheri, Mumbai, India</w:t>
+        <w:t>Mumbai, India</w:t>
       </w:r>
     </w:p>
     <w:p>
@@ -534,23 +534,7 @@
           <w:rFonts w:eastAsia="Times New Roman" w:cs="Times New Roman"/>
           <w:szCs w:val="27"/>
         </w:rPr>
-        <w:t xml:space="preserve">Authored the Global Insurance Market Index (GIMI) – UK, </w:t>
-      </w:r>
-      <w:proofErr w:type="spellStart"/>
-      <w:r>
-        <w:rPr>
-          <w:rFonts w:eastAsia="Times New Roman" w:cs="Times New Roman"/>
-          <w:szCs w:val="27"/>
-        </w:rPr>
-        <w:t>analyzing</w:t>
-      </w:r>
-      <w:proofErr w:type="spellEnd"/>
-      <w:r>
-        <w:rPr>
-          <w:rFonts w:eastAsia="Times New Roman" w:cs="Times New Roman"/>
-          <w:szCs w:val="27"/>
-        </w:rPr>
-        <w:t xml:space="preserve"> insurance rate </w:t>
+        <w:t xml:space="preserve">Authored the Global Insurance Market Index (GIMI) – UK, analyzing insurance rate </w:t>
       </w:r>
       <w:r>
         <w:rPr>
@@ -1202,7 +1186,6 @@
           <w:szCs w:val="26"/>
         </w:rPr>
       </w:pPr>
-      <w:proofErr w:type="spellStart"/>
       <w:r>
         <w:rPr>
           <w:rFonts w:eastAsia="Times New Roman" w:cs="Times New Roman"/>
@@ -1211,18 +1194,7 @@
           <w:sz w:val="26"/>
           <w:szCs w:val="26"/>
         </w:rPr>
-        <w:t>Datamatics</w:t>
-      </w:r>
-      <w:proofErr w:type="spellEnd"/>
-      <w:r>
-        <w:rPr>
-          <w:rFonts w:eastAsia="Times New Roman" w:cs="Times New Roman"/>
-          <w:b/>
-          <w:bCs/>
-          <w:sz w:val="26"/>
-          <w:szCs w:val="26"/>
-        </w:rPr>
-        <w:t xml:space="preserve"> Business Solutions</w:t>
+        <w:t>Datamatics Business Solutions</w:t>
       </w:r>
       <w:r>
         <w:rPr>
@@ -1392,21 +1364,7 @@
         <w:rPr>
           <w:rFonts w:eastAsia="Times New Roman" w:cs="Times New Roman"/>
         </w:rPr>
-        <w:t xml:space="preserve">, </w:t>
-      </w:r>
-      <w:proofErr w:type="spellStart"/>
-      <w:r>
-        <w:rPr>
-          <w:rFonts w:eastAsia="Times New Roman" w:cs="Times New Roman"/>
-        </w:rPr>
-        <w:t>Edupristine</w:t>
-      </w:r>
-      <w:proofErr w:type="spellEnd"/>
-      <w:r>
-        <w:rPr>
-          <w:rFonts w:eastAsia="Times New Roman" w:cs="Times New Roman"/>
-        </w:rPr>
-        <w:t>, 2019</w:t>
+        <w:t>, Edupristine, 2019</w:t>
       </w:r>
     </w:p>
     <w:p>

</xml_diff>